<commit_message>
Build attorney-led precedent and assessment demo
</commit_message>
<xml_diff>
--- a/ao-vite/public/demo/northstar-matter-assessment.docx
+++ b/ao-vite/public/demo/northstar-matter-assessment.docx
@@ -15,7 +15,7 @@
         <w:pStyle w:val="Title"/>
       </w:pPr>
       <w:r>
-        <w:t>Northstar Foods Matter Assessment</w:t>
+        <w:t>Initial matter assessment</w:t>
       </w:r>
     </w:p>
     <w:p>
@@ -23,7 +23,7 @@
         <w:spacing w:after="260"/>
       </w:pPr>
       <w:r>
-        <w:t>Records and discovery</w:t>
+        <w:t>Northstar Foods · Distribution-center water intrusion</w:t>
       </w:r>
     </w:p>
     <w:p>
@@ -37,7 +37,7 @@
         <w:t xml:space="preserve">To   </w:t>
       </w:r>
       <w:r>
-        <w:t>Sofia Patel</w:t>
+        <w:t>Northstar matter team</w:t>
       </w:r>
     </w:p>
     <w:p>
@@ -51,7 +51,7 @@
         <w:t xml:space="preserve">From   </w:t>
       </w:r>
       <w:r>
-        <w:t>Avery Ross</w:t>
+        <w:t>Margaret Whitfield</w:t>
       </w:r>
     </w:p>
     <w:p>
@@ -79,12 +79,12 @@
         <w:t xml:space="preserve">Date   </w:t>
       </w:r>
       <w:r>
-        <w:t>October 23, 2026 · Revision 2 · Draft for partner review</w:t>
+        <w:t>October 23, 2026 · Revision 2 · For lead attorney review</w:t>
       </w:r>
     </w:p>
     <w:p>
       <w:r>
-        <w:t>I recommend checking the former facilities manager’s archive and establishing who controls the missing reports before recommending the scope of a motion to compel production. The client’s new email changes the collection question; it does not resolve records control.</w:t>
+        <w:t>Verify the earlier repair history before settling the litigation approach. The newly supplied email and log challenge the account that the May 2023 patch resolved the problem. They do not establish whether the later leaks share a cause or resolve a timing defense.</w:t>
       </w:r>
     </w:p>
     <w:p>
@@ -92,12 +92,12 @@
         <w:pStyle w:val="Heading2"/>
       </w:pPr>
       <w:r>
-        <w:t>Client instructions</w:t>
+        <w:t>Client objective</w:t>
       </w:r>
     </w:p>
     <w:p>
       <w:r>
-        <w:t>Investigate water intrusion at the distribution center while limiting disruption to operations. The client requested a targeted records approach before broader collection.</w:t>
+        <w:t>Develop a recovery strategy without disrupting distribution operations. Northstar authorized an assessment of the evidence and options before a broader litigation commitment.</w:t>
       </w:r>
     </w:p>
     <w:p>
@@ -105,12 +105,12 @@
         <w:pStyle w:val="Heading2"/>
       </w:pPr>
       <w:r>
-        <w:t>Current record</w:t>
+        <w:t>Responsibility and evidence</w:t>
       </w:r>
     </w:p>
     <w:p>
       <w:r>
-        <w:t>The matter file contains the construction agreement, an inspection chronology and photographs. These establish the materials received, not responsibility for the alleged defects.</w:t>
+        <w:t>The agreement and photographs identify the project and reported conditions, not their cause. Compare roof and facade interfaces, contractor scope and operating conditions with the engineer before attributing all moisture to one defect.</w:t>
       </w:r>
     </w:p>
     <w:p>
@@ -118,12 +118,12 @@
         <w:pStyle w:val="Heading2"/>
       </w:pPr>
       <w:r>
-        <w:t>Earlier assumption retained</w:t>
+        <w:t>Repair history · revised</w:t>
       </w:r>
     </w:p>
     <w:p>
       <w:r>
-        <w:t>The contractor was the working custodian assumption; control of the missing reports had not been verified.</w:t>
+        <w:t>The November 2023 email describes renewed leakage after the May patch. Its maintenance attachment supports investigation of the earlier period. Obtain originals and confirm locations, observations and work performed; the client’s initial chronology is incomplete.</w:t>
       </w:r>
     </w:p>
     <w:p>
@@ -131,25 +131,12 @@
         <w:pStyle w:val="Heading2"/>
       </w:pPr>
       <w:r>
-        <w:t>New client information</w:t>
+        <w:t>Firm experience applied</w:t>
       </w:r>
     </w:p>
     <w:p>
       <w:r>
-        <w:t>The client’s October 22 email identifies a former facilities manager who may hold the reports. It does not establish that the contractor controls them.</w:t>
-      </w:r>
-    </w:p>
-    <w:p>
-      <w:pPr>
-        <w:pStyle w:val="Heading2"/>
-      </w:pPr>
-      <w:r>
-        <w:t>Relevant firm review</w:t>
-      </w:r>
-    </w:p>
-    <w:p>
-      <w:r>
-        <w:t>Sofia’s shared excerpt from my Harbor draft asks me to identify the custodian and connect each request to a disputed issue and supporting exhibit. I am using that excerpt and the published practice note for this assignment; the excerpt does not provide access to Harbor’s full file.</w:t>
+        <w:t>Harbor’s causation analysis and reviewed closeout caution against equating a completed patch with a resolved defect. Briar Glen shows why an earlier complaint must be investigated before carrying a chronology into the legal assessment. Neither outcome determines Northstar’s position.</w:t>
       </w:r>
     </w:p>
     <w:p>
@@ -162,7 +149,7 @@
         <w:pStyle w:val="Heading1"/>
       </w:pPr>
       <w:r>
-        <w:t>Evidence map and review</w:t>
+        <w:t>Evidence and recommended work</w:t>
       </w:r>
     </w:p>
     <w:p>
@@ -170,7 +157,7 @@
         <w:spacing w:after="200"/>
       </w:pPr>
       <w:r>
-        <w:t>Proposed work for partner review. The record below does not approve a motion for filing.</w:t>
+        <w:t>Investigation proposed for Margaret’s review.</w:t>
       </w:r>
     </w:p>
     <w:tbl>
@@ -313,7 +300,7 @@
                 <w:b/>
                 <w:sz w:val="21"/>
               </w:rPr>
-              <w:t>Who controls the reports?</w:t>
+              <w:t>Repair and recurrence</w:t>
             </w:r>
           </w:p>
         </w:tc>
@@ -342,7 +329,7 @@
               <w:rPr>
                 <w:sz w:val="21"/>
               </w:rPr>
-              <w:t>The client’s October 22 email identifies a former facilities manager who may hold the reports. It does not establish that the contractor controls them.</w:t>
+              <w:t>New: a November 2023 email reports post-patch leakage; its maintenance attachment records repeat visits.</w:t>
             </w:r>
           </w:p>
         </w:tc>
@@ -371,7 +358,7 @@
               <w:rPr>
                 <w:sz w:val="21"/>
               </w:rPr>
-              <w:t>Check the former manager’s archive and record the evidence of who controls each missing report.</w:t>
+              <w:t>First: preserve originals, interview the facilities witness and reconcile the 2023 chronology.</w:t>
             </w:r>
           </w:p>
         </w:tc>
@@ -406,7 +393,7 @@
                 <w:b/>
                 <w:sz w:val="21"/>
               </w:rPr>
-              <w:t>What would each request establish?</w:t>
+              <w:t>Cause and responsibility</w:t>
             </w:r>
           </w:p>
         </w:tc>
@@ -435,7 +422,7 @@
               <w:rPr>
                 <w:sz w:val="21"/>
               </w:rPr>
-              <w:t>The agreement, inspection chronology and photographs are available. They do not by themselves establish responsibility for the alleged defects.</w:t>
+              <w:t>Photographs show reported water intrusion; they do not allocate cause between trades or operating conditions.</w:t>
             </w:r>
           </w:p>
         </w:tc>
@@ -464,7 +451,7 @@
               <w:rPr>
                 <w:sz w:val="21"/>
               </w:rPr>
-              <w:t>Map each proposed request to a disputed issue and supporting material. Identify gaps for Sofia’s review.</w:t>
+              <w:t>Have the engineer compare locations, mechanisms and repairs before defining the responsibility case.</w:t>
             </w:r>
           </w:p>
         </w:tc>
@@ -499,7 +486,7 @@
                 <w:b/>
                 <w:sz w:val="21"/>
               </w:rPr>
-              <w:t>How far should collection extend?</w:t>
+              <w:t>Timing and production</w:t>
             </w:r>
           </w:p>
         </w:tc>
@@ -528,7 +515,7 @@
               <w:rPr>
                 <w:sz w:val="21"/>
               </w:rPr>
-              <w:t>The client requested a targeted records approach that limits disruption to operations.</w:t>
+              <w:t>The newly documented recurrence may affect the timing analysis. Records control is unverified.</w:t>
             </w:r>
           </w:p>
         </w:tc>
@@ -557,7 +544,7 @@
               <w:rPr>
                 <w:sz w:val="21"/>
               </w:rPr>
-              <w:t>Keep the proposed collection within that instruction. Refer any proposed expansion to the partner before it proceeds.</w:t>
+              <w:t>Review applicable authorities against verified facts. Define a targeted request after identifying its purpose and records holder.</w:t>
             </w:r>
           </w:p>
         </w:tc>
@@ -568,12 +555,12 @@
         <w:pStyle w:val="Heading2"/>
       </w:pPr>
       <w:r>
-        <w:t>Response to partner review</w:t>
+        <w:t>Why the recommendation changed</w:t>
       </w:r>
     </w:p>
     <w:p>
       <w:r>
-        <w:t>I have kept the earlier custodian assumption visible, added the October 22 email and separated its contents from the proposed response. The evidence map now identifies the archive check as work for review, rather than treating records control as established.</w:t>
+        <w:t>Revision 1 retained a provisional resolved-repair account. The forwarded email and log challenge it. Margaret directed chronology and engineering comparison to take priority over a production motion. The earlier view remains in revision 1; the effect on the legal position awaits review.</w:t>
       </w:r>
     </w:p>
     <w:p>
@@ -581,20 +568,30 @@
         <w:pStyle w:val="Heading2"/>
       </w:pPr>
       <w:r>
-        <w:t>Decision for partner review</w:t>
+        <w:t>Decision for lead attorney review</w:t>
       </w:r>
     </w:p>
     <w:p>
       <w:r>
-        <w:t>Sofia must review the evidence map and proposed approach. No motion has been approved for filing; no budget or client instruction is changed by this brief.</w:t>
+        <w:t>Margaret must review the revised assessment and authorize the proposed investigation. No motion has been approved for filing and no revised client instruction is recorded.</w:t>
+      </w:r>
+    </w:p>
+    <w:p>
+      <w:r>
+        <w:br w:type="page"/>
       </w:r>
     </w:p>
     <w:p>
       <w:pPr>
-        <w:pStyle w:val="Heading2"/>
+        <w:pStyle w:val="Heading1"/>
       </w:pPr>
       <w:r>
-        <w:t>Source record</w:t>
+        <w:t>Source record and revision history</w:t>
+      </w:r>
+    </w:p>
+    <w:p>
+      <w:r>
+        <w:t>Revision 2 · Earlier assessment retained. New evidence and Margaret’s instruction linked to the changed recommendation.</w:t>
       </w:r>
     </w:p>
     <w:p>
@@ -602,7 +599,7 @@
         <w:pStyle w:val="SourceReference"/>
       </w:pPr>
       <w:r>
-        <w:t>NS-INSTRUCTIONS · Northstar · agreed starting position · 2026-10-19</w:t>
+        <w:t>NS-INSTRUCTIONS · Northstar · objectives and agreed approach · 2026-10-19</w:t>
       </w:r>
     </w:p>
     <w:p>
@@ -610,7 +607,7 @@
         <w:pStyle w:val="SourceReference"/>
       </w:pPr>
       <w:r>
-        <w:t>NS-ASSIGNMENT · Avery’s Northstar assignment · 2026-10-20</w:t>
+        <w:t>NS-ASSIGNMENT · Northstar · assessment questions · 2026-10-20</w:t>
       </w:r>
     </w:p>
     <w:p>
@@ -618,7 +615,7 @@
         <w:pStyle w:val="SourceReference"/>
       </w:pPr>
       <w:r>
-        <w:t>NS-CHRONOLOGY · Northstar · received materials and unresolved facts · 2026-10-20</w:t>
+        <w:t>NS-CHRONOLOGY · Northstar · chronology available to revision 1 · 2026-10-20</w:t>
       </w:r>
     </w:p>
     <w:p>
@@ -626,7 +623,7 @@
         <w:pStyle w:val="SourceReference"/>
       </w:pPr>
       <w:r>
-        <w:t>NS-EMAIL-22 · Former facilities manager may hold the reports · 2026-10-22</w:t>
+        <w:t>NS-CONTRACT · Northstar · agreement and repair invoice · 2026-10-19</w:t>
       </w:r>
     </w:p>
     <w:p>
@@ -634,7 +631,7 @@
         <w:pStyle w:val="SourceReference"/>
       </w:pPr>
       <w:r>
-        <w:t>NS-REVIEW · Sofia’s review · distinguish assumption from evidence · 2026-10-22</w:t>
+        <w:t>PRACTICE-07 · Construction disputes · assessment and evidence standard · 2026-09-03</w:t>
       </w:r>
     </w:p>
     <w:p>
@@ -642,7 +639,7 @@
         <w:pStyle w:val="SourceReference"/>
       </w:pPr>
       <w:r>
-        <w:t>PRACTICE-07 · Records control and focused production requests · 2026-09-03</w:t>
+        <w:t>HARBOR-SHARED-REVIEW · Harbor · reviewed reasoning available to Northstar · 2026-10-20</w:t>
       </w:r>
     </w:p>
     <w:p>
@@ -650,7 +647,39 @@
         <w:pStyle w:val="SourceReference"/>
       </w:pPr>
       <w:r>
-        <w:t>HARBOR-SHARED-REVIEW · Avery’s Harbor draft · Sofia’s shared review · 2026-10-20</w:t>
+        <w:t>HARBOR-SHARED-CLOSE · Harbor · assessment and result available to Northstar · 2026-10-20</w:t>
+      </w:r>
+    </w:p>
+    <w:p>
+      <w:pPr>
+        <w:pStyle w:val="SourceReference"/>
+      </w:pPr>
+      <w:r>
+        <w:t>BRIAR-SHARED-CLOSE · Briar Glen · chronology lesson available to Northstar · 2026-10-20</w:t>
+      </w:r>
+    </w:p>
+    <w:p>
+      <w:pPr>
+        <w:pStyle w:val="SourceReference"/>
+      </w:pPr>
+      <w:r>
+        <w:t>NS-EMAIL-22 · Northstar · forwarded post-repair leakage email · 2026-10-22</w:t>
+      </w:r>
+    </w:p>
+    <w:p>
+      <w:pPr>
+        <w:pStyle w:val="SourceReference"/>
+      </w:pPr>
+      <w:r>
+        <w:t>NS-LOG-22 · Northstar · 2023 maintenance log · 2026-10-22</w:t>
+      </w:r>
+    </w:p>
+    <w:p>
+      <w:pPr>
+        <w:pStyle w:val="SourceReference"/>
+      </w:pPr>
+      <w:r>
+        <w:t>NS-REVISION-2 · Northstar · instruction and revision history · 2026-10-23</w:t>
       </w:r>
     </w:p>
     <w:sectPr>

</xml_diff>